<commit_message>
Initialize Data Indicator section
</commit_message>
<xml_diff>
--- a/Documentation/Report2_Project Management Plan.docx
+++ b/Documentation/Report2_Project Management Plan.docx
@@ -31,12 +31,12 @@
           <wp:inline distB="0" distT="0" distL="0" distR="0">
             <wp:extent cx="2707537" cy="832092"/>
             <wp:effectExtent b="0" l="0" r="0" t="0"/>
-            <wp:docPr id="2" name="image1.png"/>
+            <wp:docPr id="2" name="image2.png"/>
             <a:graphic>
               <a:graphicData uri="http://schemas.openxmlformats.org/drawingml/2006/picture">
                 <pic:pic>
                   <pic:nvPicPr>
-                    <pic:cNvPr id="0" name="image1.png"/>
+                    <pic:cNvPr id="0" name="image2.png"/>
                     <pic:cNvPicPr preferRelativeResize="0"/>
                   </pic:nvPicPr>
                   <pic:blipFill>
@@ -391,7 +391,7 @@
           <w:szCs w:val="28"/>
           <w:rtl w:val="0"/>
         </w:rPr>
-        <w:t xml:space="preserve">– HCM, September 2026 –</w:t>
+        <w:t xml:space="preserve">– HCM, October 2026 –</w:t>
       </w:r>
     </w:p>
     <w:p>
@@ -446,7 +446,7 @@
     </w:p>
     <w:sdt>
       <w:sdtPr>
-        <w:id w:val="30596667"/>
+        <w:id w:val="1024854139"/>
         <w:docPartObj>
           <w:docPartGallery w:val="Table of Contents"/>
           <w:docPartUnique w:val="1"/>
@@ -1288,6 +1288,84 @@
           </w:p>
         </w:tc>
       </w:tr>
+      <w:tr>
+        <w:trPr>
+          <w:cantSplit w:val="0"/>
+          <w:tblHeader w:val="0"/>
+        </w:trPr>
+        <w:tc>
+          <w:tcPr/>
+          <w:p>
+            <w:pPr>
+              <w:spacing w:after="120" w:before="120" w:line="240" w:lineRule="auto"/>
+              <w:rPr>
+                <w:rFonts w:ascii="Calibri" w:cs="Calibri" w:eastAsia="Calibri" w:hAnsi="Calibri"/>
+              </w:rPr>
+            </w:pPr>
+            <w:r>
+              <w:rPr>
+                <w:rFonts w:ascii="Calibri" w:cs="Calibri" w:eastAsia="Calibri" w:hAnsi="Calibri"/>
+                <w:rtl w:val="0"/>
+              </w:rPr>
+              <w:t xml:space="preserve">10/10/2026</w:t>
+            </w:r>
+          </w:p>
+        </w:tc>
+        <w:tc>
+          <w:tcPr/>
+          <w:p>
+            <w:pPr>
+              <w:spacing w:after="120" w:before="120" w:line="240" w:lineRule="auto"/>
+              <w:rPr>
+                <w:rFonts w:ascii="Calibri" w:cs="Calibri" w:eastAsia="Calibri" w:hAnsi="Calibri"/>
+              </w:rPr>
+            </w:pPr>
+            <w:r>
+              <w:rPr>
+                <w:rFonts w:ascii="Calibri" w:cs="Calibri" w:eastAsia="Calibri" w:hAnsi="Calibri"/>
+                <w:rtl w:val="0"/>
+              </w:rPr>
+              <w:t xml:space="preserve">M</w:t>
+            </w:r>
+          </w:p>
+        </w:tc>
+        <w:tc>
+          <w:tcPr/>
+          <w:p>
+            <w:pPr>
+              <w:spacing w:after="120" w:before="120" w:line="240" w:lineRule="auto"/>
+              <w:rPr>
+                <w:rFonts w:ascii="Calibri" w:cs="Calibri" w:eastAsia="Calibri" w:hAnsi="Calibri"/>
+              </w:rPr>
+            </w:pPr>
+            <w:r>
+              <w:rPr>
+                <w:rFonts w:ascii="Calibri" w:cs="Calibri" w:eastAsia="Calibri" w:hAnsi="Calibri"/>
+                <w:rtl w:val="0"/>
+              </w:rPr>
+              <w:t xml:space="preserve">CongNPT</w:t>
+            </w:r>
+          </w:p>
+        </w:tc>
+        <w:tc>
+          <w:tcPr/>
+          <w:p>
+            <w:pPr>
+              <w:spacing w:after="120" w:before="120" w:line="240" w:lineRule="auto"/>
+              <w:rPr>
+                <w:rFonts w:ascii="Calibri" w:cs="Calibri" w:eastAsia="Calibri" w:hAnsi="Calibri"/>
+              </w:rPr>
+            </w:pPr>
+            <w:r>
+              <w:rPr>
+                <w:rFonts w:ascii="Calibri" w:cs="Calibri" w:eastAsia="Calibri" w:hAnsi="Calibri"/>
+                <w:rtl w:val="0"/>
+              </w:rPr>
+              <w:t xml:space="preserve">Updated plan to the revised scope: WBS and effort, objectives, risks, quality scenarios, training, deliverables and tools aligned with the official tech stack</w:t>
+            </w:r>
+          </w:p>
+        </w:tc>
+      </w:tr>
     </w:tbl>
     <w:p>
       <w:pPr>
@@ -1657,7 +1735,7 @@
                 <w:szCs w:val="22"/>
                 <w:rtl w:val="0"/>
               </w:rPr>
-              <w:t xml:space="preserve">System Administration Module</w:t>
+              <w:t xml:space="preserve">Account and Master Data Module</w:t>
             </w:r>
           </w:p>
         </w:tc>
@@ -1712,7 +1790,7 @@
                 <w:szCs w:val="22"/>
                 <w:rtl w:val="0"/>
               </w:rPr>
-              <w:t xml:space="preserve">19</w:t>
+              <w:t xml:space="preserve">16</w:t>
             </w:r>
           </w:p>
         </w:tc>
@@ -1766,7 +1844,7 @@
                 <w:szCs w:val="22"/>
                 <w:rtl w:val="0"/>
               </w:rPr>
-              <w:t xml:space="preserve">Account, Role &amp; Assignment Management</w:t>
+              <w:t xml:space="preserve">Account Creation, Bulk Import &amp; Google Linking</w:t>
             </w:r>
           </w:p>
         </w:tc>
@@ -1813,7 +1891,7 @@
                 <w:szCs w:val="22"/>
                 <w:rtl w:val="0"/>
               </w:rPr>
-              <w:t xml:space="preserve">6</w:t>
+              <w:t xml:space="preserve">7</w:t>
             </w:r>
           </w:p>
         </w:tc>
@@ -1867,30 +1945,30 @@
                 <w:szCs w:val="22"/>
                 <w:rtl w:val="0"/>
               </w:rPr>
-              <w:t xml:space="preserve">Ingestion Source &amp; Health Monitoring</w:t>
-            </w:r>
-          </w:p>
-        </w:tc>
-        <w:tc>
-          <w:tcPr/>
-          <w:p>
-            <w:pPr>
-              <w:spacing w:after="120" w:before="120" w:lineRule="auto"/>
-              <w:ind w:left="33" w:firstLine="0"/>
-              <w:rPr>
-                <w:rFonts w:ascii="Calibri" w:cs="Calibri" w:eastAsia="Calibri" w:hAnsi="Calibri"/>
-                <w:sz w:val="22"/>
-                <w:szCs w:val="22"/>
-              </w:rPr>
-            </w:pPr>
-            <w:r>
-              <w:rPr>
-                <w:rFonts w:ascii="Calibri" w:cs="Calibri" w:eastAsia="Calibri" w:hAnsi="Calibri"/>
-                <w:sz w:val="22"/>
-                <w:szCs w:val="22"/>
-                <w:rtl w:val="0"/>
-              </w:rPr>
-              <w:t xml:space="preserve">Complex</w:t>
+              <w:t xml:space="preserve">Roles, Account Status &amp; Account Dashboard</w:t>
+            </w:r>
+          </w:p>
+        </w:tc>
+        <w:tc>
+          <w:tcPr/>
+          <w:p>
+            <w:pPr>
+              <w:spacing w:after="120" w:before="120" w:lineRule="auto"/>
+              <w:ind w:left="33" w:firstLine="0"/>
+              <w:rPr>
+                <w:rFonts w:ascii="Calibri" w:cs="Calibri" w:eastAsia="Calibri" w:hAnsi="Calibri"/>
+                <w:sz w:val="22"/>
+                <w:szCs w:val="22"/>
+              </w:rPr>
+            </w:pPr>
+            <w:r>
+              <w:rPr>
+                <w:rFonts w:ascii="Calibri" w:cs="Calibri" w:eastAsia="Calibri" w:hAnsi="Calibri"/>
+                <w:sz w:val="22"/>
+                <w:szCs w:val="22"/>
+                <w:rtl w:val="0"/>
+              </w:rPr>
+              <w:t xml:space="preserve">Simple</w:t>
             </w:r>
           </w:p>
         </w:tc>
@@ -1914,7 +1992,7 @@
                 <w:szCs w:val="22"/>
                 <w:rtl w:val="0"/>
               </w:rPr>
-              <w:t xml:space="preserve">8</w:t>
+              <w:t xml:space="preserve">4</w:t>
             </w:r>
           </w:p>
         </w:tc>
@@ -1968,7 +2046,7 @@
                 <w:szCs w:val="22"/>
                 <w:rtl w:val="0"/>
               </w:rPr>
-              <w:t xml:space="preserve">Backup &amp; Restore</w:t>
+              <w:t xml:space="preserve">Terms, Faculties, Subjects &amp; Support Categories</w:t>
             </w:r>
           </w:p>
         </w:tc>
@@ -2140,7 +2218,7 @@
                 <w:szCs w:val="22"/>
                 <w:rtl w:val="0"/>
               </w:rPr>
-              <w:t xml:space="preserve">30</w:t>
+              <w:t xml:space="preserve">27</w:t>
             </w:r>
           </w:p>
         </w:tc>
@@ -2194,7 +2272,7 @@
                 <w:szCs w:val="22"/>
                 <w:rtl w:val="0"/>
               </w:rPr>
-              <w:t xml:space="preserve">Consent Registry &amp; Purpose Catalogue</w:t>
+              <w:t xml:space="preserve">Indicators, Data Attributes &amp; Consent Purposes</w:t>
             </w:r>
           </w:p>
         </w:tc>
@@ -2241,7 +2319,7 @@
                 <w:szCs w:val="22"/>
                 <w:rtl w:val="0"/>
               </w:rPr>
-              <w:t xml:space="preserve">9</w:t>
+              <w:t xml:space="preserve">8</w:t>
             </w:r>
           </w:p>
         </w:tc>
@@ -2295,7 +2373,7 @@
                 <w:szCs w:val="22"/>
                 <w:rtl w:val="0"/>
               </w:rPr>
-              <w:t xml:space="preserve">Purpose-Based Access Policy Engine</w:t>
+              <w:t xml:space="preserve">Purpose-Based Access Policy &amp; Access Log</w:t>
             </w:r>
           </w:p>
         </w:tc>
@@ -2396,7 +2474,7 @@
                 <w:szCs w:val="22"/>
                 <w:rtl w:val="0"/>
               </w:rPr>
-              <w:t xml:space="preserve">Access Log, Emergency Access &amp; Cryptographic Erasure</w:t>
+              <w:t xml:space="preserve">Emergency Access &amp; Cryptographic Erasure</w:t>
             </w:r>
           </w:p>
         </w:tc>
@@ -2443,7 +2521,7 @@
                 <w:szCs w:val="22"/>
                 <w:rtl w:val="0"/>
               </w:rPr>
-              <w:t xml:space="preserve">11</w:t>
+              <w:t xml:space="preserve">9</w:t>
             </w:r>
           </w:p>
         </w:tc>
@@ -2513,7 +2591,7 @@
                 <w:szCs w:val="22"/>
                 <w:rtl w:val="0"/>
               </w:rPr>
-              <w:t xml:space="preserve">Advisor Workspace and Case Management Module</w:t>
+              <w:t xml:space="preserve">Support Request and Case Matching Module</w:t>
             </w:r>
           </w:p>
         </w:tc>
@@ -2568,7 +2646,7 @@
                 <w:szCs w:val="22"/>
                 <w:rtl w:val="0"/>
               </w:rPr>
-              <w:t xml:space="preserve">29</w:t>
+              <w:t xml:space="preserve">17</w:t>
             </w:r>
           </w:p>
         </w:tc>
@@ -2622,30 +2700,30 @@
                 <w:szCs w:val="22"/>
                 <w:rtl w:val="0"/>
               </w:rPr>
-              <w:t xml:space="preserve">Caseload &amp; Student Profile with Provenance</w:t>
-            </w:r>
-          </w:p>
-        </w:tc>
-        <w:tc>
-          <w:tcPr/>
-          <w:p>
-            <w:pPr>
-              <w:spacing w:after="120" w:before="120" w:lineRule="auto"/>
-              <w:ind w:left="33" w:firstLine="0"/>
-              <w:rPr>
-                <w:rFonts w:ascii="Calibri" w:cs="Calibri" w:eastAsia="Calibri" w:hAnsi="Calibri"/>
-                <w:sz w:val="22"/>
-                <w:szCs w:val="22"/>
-              </w:rPr>
-            </w:pPr>
-            <w:r>
-              <w:rPr>
-                <w:rFonts w:ascii="Calibri" w:cs="Calibri" w:eastAsia="Calibri" w:hAnsi="Calibri"/>
-                <w:sz w:val="22"/>
-                <w:szCs w:val="22"/>
-                <w:rtl w:val="0"/>
-              </w:rPr>
-              <w:t xml:space="preserve">Complex</w:t>
+              <w:t xml:space="preserve">Support Request Form &amp; Data Sharing</w:t>
+            </w:r>
+          </w:p>
+        </w:tc>
+        <w:tc>
+          <w:tcPr/>
+          <w:p>
+            <w:pPr>
+              <w:spacing w:after="120" w:before="120" w:lineRule="auto"/>
+              <w:ind w:left="33" w:firstLine="0"/>
+              <w:rPr>
+                <w:rFonts w:ascii="Calibri" w:cs="Calibri" w:eastAsia="Calibri" w:hAnsi="Calibri"/>
+                <w:sz w:val="22"/>
+                <w:szCs w:val="22"/>
+              </w:rPr>
+            </w:pPr>
+            <w:r>
+              <w:rPr>
+                <w:rFonts w:ascii="Calibri" w:cs="Calibri" w:eastAsia="Calibri" w:hAnsi="Calibri"/>
+                <w:sz w:val="22"/>
+                <w:szCs w:val="22"/>
+                <w:rtl w:val="0"/>
+              </w:rPr>
+              <w:t xml:space="preserve">Medium</w:t>
             </w:r>
           </w:p>
         </w:tc>
@@ -2669,7 +2747,7 @@
                 <w:szCs w:val="22"/>
                 <w:rtl w:val="0"/>
               </w:rPr>
-              <w:t xml:space="preserve">10</w:t>
+              <w:t xml:space="preserve">6</w:t>
             </w:r>
           </w:p>
         </w:tc>
@@ -2723,30 +2801,30 @@
                 <w:szCs w:val="22"/>
                 <w:rtl w:val="0"/>
               </w:rPr>
-              <w:t xml:space="preserve">Case Workflow (Notes, Referral, Triage to Closure)</w:t>
-            </w:r>
-          </w:p>
-        </w:tc>
-        <w:tc>
-          <w:tcPr/>
-          <w:p>
-            <w:pPr>
-              <w:spacing w:after="120" w:before="120" w:lineRule="auto"/>
-              <w:ind w:left="33" w:firstLine="0"/>
-              <w:rPr>
-                <w:rFonts w:ascii="Calibri" w:cs="Calibri" w:eastAsia="Calibri" w:hAnsi="Calibri"/>
-                <w:sz w:val="22"/>
-                <w:szCs w:val="22"/>
-              </w:rPr>
-            </w:pPr>
-            <w:r>
-              <w:rPr>
-                <w:rFonts w:ascii="Calibri" w:cs="Calibri" w:eastAsia="Calibri" w:hAnsi="Calibri"/>
-                <w:sz w:val="22"/>
-                <w:szCs w:val="22"/>
-                <w:rtl w:val="0"/>
-              </w:rPr>
-              <w:t xml:space="preserve">Complex</w:t>
+              <w:t xml:space="preserve">Manual Case Matching &amp; Contact Notification</w:t>
+            </w:r>
+          </w:p>
+        </w:tc>
+        <w:tc>
+          <w:tcPr/>
+          <w:p>
+            <w:pPr>
+              <w:spacing w:after="120" w:before="120" w:lineRule="auto"/>
+              <w:ind w:left="33" w:firstLine="0"/>
+              <w:rPr>
+                <w:rFonts w:ascii="Calibri" w:cs="Calibri" w:eastAsia="Calibri" w:hAnsi="Calibri"/>
+                <w:sz w:val="22"/>
+                <w:szCs w:val="22"/>
+              </w:rPr>
+            </w:pPr>
+            <w:r>
+              <w:rPr>
+                <w:rFonts w:ascii="Calibri" w:cs="Calibri" w:eastAsia="Calibri" w:hAnsi="Calibri"/>
+                <w:sz w:val="22"/>
+                <w:szCs w:val="22"/>
+                <w:rtl w:val="0"/>
+              </w:rPr>
+              <w:t xml:space="preserve">Medium</w:t>
             </w:r>
           </w:p>
         </w:tc>
@@ -2770,7 +2848,7 @@
                 <w:szCs w:val="22"/>
                 <w:rtl w:val="0"/>
               </w:rPr>
-              <w:t xml:space="preserve">10</w:t>
+              <w:t xml:space="preserve">6</w:t>
             </w:r>
           </w:p>
         </w:tc>
@@ -2824,30 +2902,30 @@
                 <w:szCs w:val="22"/>
                 <w:rtl w:val="0"/>
               </w:rPr>
-              <w:t xml:space="preserve">Point-in-Time Reconstruction &amp; Consent Request</w:t>
-            </w:r>
-          </w:p>
-        </w:tc>
-        <w:tc>
-          <w:tcPr/>
-          <w:p>
-            <w:pPr>
-              <w:spacing w:after="120" w:before="120" w:lineRule="auto"/>
-              <w:ind w:left="33" w:firstLine="0"/>
-              <w:rPr>
-                <w:rFonts w:ascii="Calibri" w:cs="Calibri" w:eastAsia="Calibri" w:hAnsi="Calibri"/>
-                <w:sz w:val="22"/>
-                <w:szCs w:val="22"/>
-              </w:rPr>
-            </w:pPr>
-            <w:r>
-              <w:rPr>
-                <w:rFonts w:ascii="Calibri" w:cs="Calibri" w:eastAsia="Calibri" w:hAnsi="Calibri"/>
-                <w:sz w:val="22"/>
-                <w:szCs w:val="22"/>
-                <w:rtl w:val="0"/>
-              </w:rPr>
-              <w:t xml:space="preserve">Complex</w:t>
+              <w:t xml:space="preserve">Assignment Changes &amp; Escalation Handling</w:t>
+            </w:r>
+          </w:p>
+        </w:tc>
+        <w:tc>
+          <w:tcPr/>
+          <w:p>
+            <w:pPr>
+              <w:spacing w:after="120" w:before="120" w:lineRule="auto"/>
+              <w:ind w:left="33" w:firstLine="0"/>
+              <w:rPr>
+                <w:rFonts w:ascii="Calibri" w:cs="Calibri" w:eastAsia="Calibri" w:hAnsi="Calibri"/>
+                <w:sz w:val="22"/>
+                <w:szCs w:val="22"/>
+              </w:rPr>
+            </w:pPr>
+            <w:r>
+              <w:rPr>
+                <w:rFonts w:ascii="Calibri" w:cs="Calibri" w:eastAsia="Calibri" w:hAnsi="Calibri"/>
+                <w:sz w:val="22"/>
+                <w:szCs w:val="22"/>
+                <w:rtl w:val="0"/>
+              </w:rPr>
+              <w:t xml:space="preserve">Medium</w:t>
             </w:r>
           </w:p>
         </w:tc>
@@ -2871,7 +2949,7 @@
                 <w:szCs w:val="22"/>
                 <w:rtl w:val="0"/>
               </w:rPr>
-              <w:t xml:space="preserve">9</w:t>
+              <w:t xml:space="preserve">5</w:t>
             </w:r>
           </w:p>
         </w:tc>
@@ -2941,7 +3019,7 @@
                 <w:szCs w:val="22"/>
                 <w:rtl w:val="0"/>
               </w:rPr>
-              <w:t xml:space="preserve">Welfare Referral Module</w:t>
+              <w:t xml:space="preserve">Advisor Workspace and Case Management Module</w:t>
             </w:r>
           </w:p>
         </w:tc>
@@ -2996,7 +3074,7 @@
                 <w:szCs w:val="22"/>
                 <w:rtl w:val="0"/>
               </w:rPr>
-              <w:t xml:space="preserve">17</w:t>
+              <w:t xml:space="preserve">25</w:t>
             </w:r>
           </w:p>
         </w:tc>
@@ -3050,30 +3128,30 @@
                 <w:szCs w:val="22"/>
                 <w:rtl w:val="0"/>
               </w:rPr>
-              <w:t xml:space="preserve">Referral Intake &amp; Triage</w:t>
-            </w:r>
-          </w:p>
-        </w:tc>
-        <w:tc>
-          <w:tcPr/>
-          <w:p>
-            <w:pPr>
-              <w:spacing w:after="120" w:before="120" w:lineRule="auto"/>
-              <w:ind w:left="33" w:firstLine="0"/>
-              <w:rPr>
-                <w:rFonts w:ascii="Calibri" w:cs="Calibri" w:eastAsia="Calibri" w:hAnsi="Calibri"/>
-                <w:sz w:val="22"/>
-                <w:szCs w:val="22"/>
-              </w:rPr>
-            </w:pPr>
-            <w:r>
-              <w:rPr>
-                <w:rFonts w:ascii="Calibri" w:cs="Calibri" w:eastAsia="Calibri" w:hAnsi="Calibri"/>
-                <w:sz w:val="22"/>
-                <w:szCs w:val="22"/>
-                <w:rtl w:val="0"/>
-              </w:rPr>
-              <w:t xml:space="preserve">Medium</w:t>
+              <w:t xml:space="preserve">Case List &amp; Student Profile with Provenance</w:t>
+            </w:r>
+          </w:p>
+        </w:tc>
+        <w:tc>
+          <w:tcPr/>
+          <w:p>
+            <w:pPr>
+              <w:spacing w:after="120" w:before="120" w:lineRule="auto"/>
+              <w:ind w:left="33" w:firstLine="0"/>
+              <w:rPr>
+                <w:rFonts w:ascii="Calibri" w:cs="Calibri" w:eastAsia="Calibri" w:hAnsi="Calibri"/>
+                <w:sz w:val="22"/>
+                <w:szCs w:val="22"/>
+              </w:rPr>
+            </w:pPr>
+            <w:r>
+              <w:rPr>
+                <w:rFonts w:ascii="Calibri" w:cs="Calibri" w:eastAsia="Calibri" w:hAnsi="Calibri"/>
+                <w:sz w:val="22"/>
+                <w:szCs w:val="22"/>
+                <w:rtl w:val="0"/>
+              </w:rPr>
+              <w:t xml:space="preserve">Complex</w:t>
             </w:r>
           </w:p>
         </w:tc>
@@ -3097,7 +3175,7 @@
                 <w:szCs w:val="22"/>
                 <w:rtl w:val="0"/>
               </w:rPr>
-              <w:t xml:space="preserve">6</w:t>
+              <w:t xml:space="preserve">8</w:t>
             </w:r>
           </w:p>
         </w:tc>
@@ -3151,30 +3229,30 @@
                 <w:szCs w:val="22"/>
                 <w:rtl w:val="0"/>
               </w:rPr>
-              <w:t xml:space="preserve">Intervention &amp; Support Tracking</w:t>
-            </w:r>
-          </w:p>
-        </w:tc>
-        <w:tc>
-          <w:tcPr/>
-          <w:p>
-            <w:pPr>
-              <w:spacing w:after="120" w:before="120" w:lineRule="auto"/>
-              <w:ind w:left="33" w:firstLine="0"/>
-              <w:rPr>
-                <w:rFonts w:ascii="Calibri" w:cs="Calibri" w:eastAsia="Calibri" w:hAnsi="Calibri"/>
-                <w:sz w:val="22"/>
-                <w:szCs w:val="22"/>
-              </w:rPr>
-            </w:pPr>
-            <w:r>
-              <w:rPr>
-                <w:rFonts w:ascii="Calibri" w:cs="Calibri" w:eastAsia="Calibri" w:hAnsi="Calibri"/>
-                <w:sz w:val="22"/>
-                <w:szCs w:val="22"/>
-                <w:rtl w:val="0"/>
-              </w:rPr>
-              <w:t xml:space="preserve">Medium</w:t>
+              <w:t xml:space="preserve">Case Notes, Stages &amp; Referrals</w:t>
+            </w:r>
+          </w:p>
+        </w:tc>
+        <w:tc>
+          <w:tcPr/>
+          <w:p>
+            <w:pPr>
+              <w:spacing w:after="120" w:before="120" w:lineRule="auto"/>
+              <w:ind w:left="33" w:firstLine="0"/>
+              <w:rPr>
+                <w:rFonts w:ascii="Calibri" w:cs="Calibri" w:eastAsia="Calibri" w:hAnsi="Calibri"/>
+                <w:sz w:val="22"/>
+                <w:szCs w:val="22"/>
+              </w:rPr>
+            </w:pPr>
+            <w:r>
+              <w:rPr>
+                <w:rFonts w:ascii="Calibri" w:cs="Calibri" w:eastAsia="Calibri" w:hAnsi="Calibri"/>
+                <w:sz w:val="22"/>
+                <w:szCs w:val="22"/>
+                <w:rtl w:val="0"/>
+              </w:rPr>
+              <w:t xml:space="preserve">Complex</w:t>
             </w:r>
           </w:p>
         </w:tc>
@@ -3198,7 +3276,7 @@
                 <w:szCs w:val="22"/>
                 <w:rtl w:val="0"/>
               </w:rPr>
-              <w:t xml:space="preserve">6</w:t>
+              <w:t xml:space="preserve">9</w:t>
             </w:r>
           </w:p>
         </w:tc>
@@ -3252,30 +3330,30 @@
                 <w:szCs w:val="22"/>
                 <w:rtl w:val="0"/>
               </w:rPr>
-              <w:t xml:space="preserve">Escalation &amp; Anonymised Reporting</w:t>
-            </w:r>
-          </w:p>
-        </w:tc>
-        <w:tc>
-          <w:tcPr/>
-          <w:p>
-            <w:pPr>
-              <w:spacing w:after="120" w:before="120" w:lineRule="auto"/>
-              <w:ind w:left="33" w:firstLine="0"/>
-              <w:rPr>
-                <w:rFonts w:ascii="Calibri" w:cs="Calibri" w:eastAsia="Calibri" w:hAnsi="Calibri"/>
-                <w:sz w:val="22"/>
-                <w:szCs w:val="22"/>
-              </w:rPr>
-            </w:pPr>
-            <w:r>
-              <w:rPr>
-                <w:rFonts w:ascii="Calibri" w:cs="Calibri" w:eastAsia="Calibri" w:hAnsi="Calibri"/>
-                <w:sz w:val="22"/>
-                <w:szCs w:val="22"/>
-                <w:rtl w:val="0"/>
-              </w:rPr>
-              <w:t xml:space="preserve">Medium</w:t>
+              <w:t xml:space="preserve">Indicator Outreach, Point-in-Time View &amp; Consent Requests</w:t>
+            </w:r>
+          </w:p>
+        </w:tc>
+        <w:tc>
+          <w:tcPr/>
+          <w:p>
+            <w:pPr>
+              <w:spacing w:after="120" w:before="120" w:lineRule="auto"/>
+              <w:ind w:left="33" w:firstLine="0"/>
+              <w:rPr>
+                <w:rFonts w:ascii="Calibri" w:cs="Calibri" w:eastAsia="Calibri" w:hAnsi="Calibri"/>
+                <w:sz w:val="22"/>
+                <w:szCs w:val="22"/>
+              </w:rPr>
+            </w:pPr>
+            <w:r>
+              <w:rPr>
+                <w:rFonts w:ascii="Calibri" w:cs="Calibri" w:eastAsia="Calibri" w:hAnsi="Calibri"/>
+                <w:sz w:val="22"/>
+                <w:szCs w:val="22"/>
+                <w:rtl w:val="0"/>
+              </w:rPr>
+              <w:t xml:space="preserve">Complex</w:t>
             </w:r>
           </w:p>
         </w:tc>
@@ -3299,7 +3377,7 @@
                 <w:szCs w:val="22"/>
                 <w:rtl w:val="0"/>
               </w:rPr>
-              <w:t xml:space="preserve">5</w:t>
+              <w:t xml:space="preserve">8</w:t>
             </w:r>
           </w:p>
         </w:tc>
@@ -3369,7 +3447,7 @@
                 <w:szCs w:val="22"/>
                 <w:rtl w:val="0"/>
               </w:rPr>
-              <w:t xml:space="preserve">Student Self-Service Module</w:t>
+              <w:t xml:space="preserve">Welfare Support Module</w:t>
             </w:r>
           </w:p>
         </w:tc>
@@ -3424,7 +3502,7 @@
                 <w:szCs w:val="22"/>
                 <w:rtl w:val="0"/>
               </w:rPr>
-              <w:t xml:space="preserve">19</w:t>
+              <w:t xml:space="preserve">14</w:t>
             </w:r>
           </w:p>
         </w:tc>
@@ -3478,30 +3556,30 @@
                 <w:szCs w:val="22"/>
                 <w:rtl w:val="0"/>
               </w:rPr>
-              <w:t xml:space="preserve">Student Profile &amp; Provenance View</w:t>
-            </w:r>
-          </w:p>
-        </w:tc>
-        <w:tc>
-          <w:tcPr/>
-          <w:p>
-            <w:pPr>
-              <w:spacing w:after="120" w:before="120" w:lineRule="auto"/>
-              <w:ind w:left="33" w:firstLine="0"/>
-              <w:rPr>
-                <w:rFonts w:ascii="Calibri" w:cs="Calibri" w:eastAsia="Calibri" w:hAnsi="Calibri"/>
-                <w:sz w:val="22"/>
-                <w:szCs w:val="22"/>
-              </w:rPr>
-            </w:pPr>
-            <w:r>
-              <w:rPr>
-                <w:rFonts w:ascii="Calibri" w:cs="Calibri" w:eastAsia="Calibri" w:hAnsi="Calibri"/>
-                <w:sz w:val="22"/>
-                <w:szCs w:val="22"/>
-                <w:rtl w:val="0"/>
-              </w:rPr>
-              <w:t xml:space="preserve">Medium</w:t>
+              <w:t xml:space="preserve">Referral Intake &amp; Triage</w:t>
+            </w:r>
+          </w:p>
+        </w:tc>
+        <w:tc>
+          <w:tcPr/>
+          <w:p>
+            <w:pPr>
+              <w:spacing w:after="120" w:before="120" w:lineRule="auto"/>
+              <w:ind w:left="33" w:firstLine="0"/>
+              <w:rPr>
+                <w:rFonts w:ascii="Calibri" w:cs="Calibri" w:eastAsia="Calibri" w:hAnsi="Calibri"/>
+                <w:sz w:val="22"/>
+                <w:szCs w:val="22"/>
+              </w:rPr>
+            </w:pPr>
+            <w:r>
+              <w:rPr>
+                <w:rFonts w:ascii="Calibri" w:cs="Calibri" w:eastAsia="Calibri" w:hAnsi="Calibri"/>
+                <w:sz w:val="22"/>
+                <w:szCs w:val="22"/>
+                <w:rtl w:val="0"/>
+              </w:rPr>
+              <w:t xml:space="preserve">Simple</w:t>
             </w:r>
           </w:p>
         </w:tc>
@@ -3525,7 +3603,7 @@
                 <w:szCs w:val="22"/>
                 <w:rtl w:val="0"/>
               </w:rPr>
-              <w:t xml:space="preserve">6</w:t>
+              <w:t xml:space="preserve">4</w:t>
             </w:r>
           </w:p>
         </w:tc>
@@ -3579,30 +3657,30 @@
                 <w:szCs w:val="22"/>
                 <w:rtl w:val="0"/>
               </w:rPr>
-              <w:t xml:space="preserve">Consent Self-Service &amp; Access History</w:t>
-            </w:r>
-          </w:p>
-        </w:tc>
-        <w:tc>
-          <w:tcPr/>
-          <w:p>
-            <w:pPr>
-              <w:spacing w:after="120" w:before="120" w:lineRule="auto"/>
-              <w:ind w:left="33" w:firstLine="0"/>
-              <w:rPr>
-                <w:rFonts w:ascii="Calibri" w:cs="Calibri" w:eastAsia="Calibri" w:hAnsi="Calibri"/>
-                <w:sz w:val="22"/>
-                <w:szCs w:val="22"/>
-              </w:rPr>
-            </w:pPr>
-            <w:r>
-              <w:rPr>
-                <w:rFonts w:ascii="Calibri" w:cs="Calibri" w:eastAsia="Calibri" w:hAnsi="Calibri"/>
-                <w:sz w:val="22"/>
-                <w:szCs w:val="22"/>
-                <w:rtl w:val="0"/>
-              </w:rPr>
-              <w:t xml:space="preserve">Complex</w:t>
+              <w:t xml:space="preserve">Interventions &amp; Support Grants</w:t>
+            </w:r>
+          </w:p>
+        </w:tc>
+        <w:tc>
+          <w:tcPr/>
+          <w:p>
+            <w:pPr>
+              <w:spacing w:after="120" w:before="120" w:lineRule="auto"/>
+              <w:ind w:left="33" w:firstLine="0"/>
+              <w:rPr>
+                <w:rFonts w:ascii="Calibri" w:cs="Calibri" w:eastAsia="Calibri" w:hAnsi="Calibri"/>
+                <w:sz w:val="22"/>
+                <w:szCs w:val="22"/>
+              </w:rPr>
+            </w:pPr>
+            <w:r>
+              <w:rPr>
+                <w:rFonts w:ascii="Calibri" w:cs="Calibri" w:eastAsia="Calibri" w:hAnsi="Calibri"/>
+                <w:sz w:val="22"/>
+                <w:szCs w:val="22"/>
+                <w:rtl w:val="0"/>
+              </w:rPr>
+              <w:t xml:space="preserve">Medium</w:t>
             </w:r>
           </w:p>
         </w:tc>
@@ -3626,7 +3704,7 @@
                 <w:szCs w:val="22"/>
                 <w:rtl w:val="0"/>
               </w:rPr>
-              <w:t xml:space="preserve">8</w:t>
+              <w:t xml:space="preserve">5</w:t>
             </w:r>
           </w:p>
         </w:tc>
@@ -3680,7 +3758,7 @@
                 <w:szCs w:val="22"/>
                 <w:rtl w:val="0"/>
               </w:rPr>
-              <w:t xml:space="preserve">Event Check-in &amp; Correction Requests</w:t>
+              <w:t xml:space="preserve">External Referrals &amp; Escalation</w:t>
             </w:r>
           </w:p>
         </w:tc>
@@ -3797,7 +3875,7 @@
                 <w:szCs w:val="22"/>
                 <w:rtl w:val="0"/>
               </w:rPr>
-              <w:t xml:space="preserve">Programme Reporting Module</w:t>
+              <w:t xml:space="preserve">Student Self-Service Module</w:t>
             </w:r>
           </w:p>
         </w:tc>
@@ -3906,30 +3984,30 @@
                 <w:szCs w:val="22"/>
                 <w:rtl w:val="0"/>
               </w:rPr>
-              <w:t xml:space="preserve">Cohort &amp; Participation Analytics</w:t>
-            </w:r>
-          </w:p>
-        </w:tc>
-        <w:tc>
-          <w:tcPr/>
-          <w:p>
-            <w:pPr>
-              <w:spacing w:after="120" w:before="120" w:lineRule="auto"/>
-              <w:ind w:left="33" w:firstLine="0"/>
-              <w:rPr>
-                <w:rFonts w:ascii="Calibri" w:cs="Calibri" w:eastAsia="Calibri" w:hAnsi="Calibri"/>
-                <w:sz w:val="22"/>
-                <w:szCs w:val="22"/>
-              </w:rPr>
-            </w:pPr>
-            <w:r>
-              <w:rPr>
-                <w:rFonts w:ascii="Calibri" w:cs="Calibri" w:eastAsia="Calibri" w:hAnsi="Calibri"/>
-                <w:sz w:val="22"/>
-                <w:szCs w:val="22"/>
-                <w:rtl w:val="0"/>
-              </w:rPr>
-              <w:t xml:space="preserve">Complex</w:t>
+              <w:t xml:space="preserve">Case Tracking &amp; Profile View</w:t>
+            </w:r>
+          </w:p>
+        </w:tc>
+        <w:tc>
+          <w:tcPr/>
+          <w:p>
+            <w:pPr>
+              <w:spacing w:after="120" w:before="120" w:lineRule="auto"/>
+              <w:ind w:left="33" w:firstLine="0"/>
+              <w:rPr>
+                <w:rFonts w:ascii="Calibri" w:cs="Calibri" w:eastAsia="Calibri" w:hAnsi="Calibri"/>
+                <w:sz w:val="22"/>
+                <w:szCs w:val="22"/>
+              </w:rPr>
+            </w:pPr>
+            <w:r>
+              <w:rPr>
+                <w:rFonts w:ascii="Calibri" w:cs="Calibri" w:eastAsia="Calibri" w:hAnsi="Calibri"/>
+                <w:sz w:val="22"/>
+                <w:szCs w:val="22"/>
+                <w:rtl w:val="0"/>
+              </w:rPr>
+              <w:t xml:space="preserve">Medium</w:t>
             </w:r>
           </w:p>
         </w:tc>
@@ -3953,7 +4031,7 @@
                 <w:szCs w:val="22"/>
                 <w:rtl w:val="0"/>
               </w:rPr>
-              <w:t xml:space="preserve">7</w:t>
+              <w:t xml:space="preserve">5</w:t>
             </w:r>
           </w:p>
         </w:tc>
@@ -4007,30 +4085,30 @@
                 <w:szCs w:val="22"/>
                 <w:rtl w:val="0"/>
               </w:rPr>
-              <w:t xml:space="preserve">Caseload &amp; Closure-Time Reporting</w:t>
-            </w:r>
-          </w:p>
-        </w:tc>
-        <w:tc>
-          <w:tcPr/>
-          <w:p>
-            <w:pPr>
-              <w:spacing w:after="120" w:before="120" w:lineRule="auto"/>
-              <w:ind w:left="33" w:firstLine="0"/>
-              <w:rPr>
-                <w:rFonts w:ascii="Calibri" w:cs="Calibri" w:eastAsia="Calibri" w:hAnsi="Calibri"/>
-                <w:sz w:val="22"/>
-                <w:szCs w:val="22"/>
-              </w:rPr>
-            </w:pPr>
-            <w:r>
-              <w:rPr>
-                <w:rFonts w:ascii="Calibri" w:cs="Calibri" w:eastAsia="Calibri" w:hAnsi="Calibri"/>
-                <w:sz w:val="22"/>
-                <w:szCs w:val="22"/>
-                <w:rtl w:val="0"/>
-              </w:rPr>
-              <w:t xml:space="preserve">Medium</w:t>
+              <w:t xml:space="preserve">Consent Management &amp; Access History</w:t>
+            </w:r>
+          </w:p>
+        </w:tc>
+        <w:tc>
+          <w:tcPr/>
+          <w:p>
+            <w:pPr>
+              <w:spacing w:after="120" w:before="120" w:lineRule="auto"/>
+              <w:ind w:left="33" w:firstLine="0"/>
+              <w:rPr>
+                <w:rFonts w:ascii="Calibri" w:cs="Calibri" w:eastAsia="Calibri" w:hAnsi="Calibri"/>
+                <w:sz w:val="22"/>
+                <w:szCs w:val="22"/>
+              </w:rPr>
+            </w:pPr>
+            <w:r>
+              <w:rPr>
+                <w:rFonts w:ascii="Calibri" w:cs="Calibri" w:eastAsia="Calibri" w:hAnsi="Calibri"/>
+                <w:sz w:val="22"/>
+                <w:szCs w:val="22"/>
+                <w:rtl w:val="0"/>
+              </w:rPr>
+              <w:t xml:space="preserve">Complex</w:t>
             </w:r>
           </w:p>
         </w:tc>
@@ -4054,7 +4132,7 @@
                 <w:szCs w:val="22"/>
                 <w:rtl w:val="0"/>
               </w:rPr>
-              <w:t xml:space="preserve">5</w:t>
+              <w:t xml:space="preserve">7</w:t>
             </w:r>
           </w:p>
         </w:tc>
@@ -4108,30 +4186,30 @@
                 <w:szCs w:val="22"/>
                 <w:rtl w:val="0"/>
               </w:rPr>
-              <w:t xml:space="preserve">Assignment Approval &amp; Term Export</w:t>
-            </w:r>
-          </w:p>
-        </w:tc>
-        <w:tc>
-          <w:tcPr/>
-          <w:p>
-            <w:pPr>
-              <w:spacing w:after="120" w:before="120" w:lineRule="auto"/>
-              <w:ind w:left="33" w:firstLine="0"/>
-              <w:rPr>
-                <w:rFonts w:ascii="Calibri" w:cs="Calibri" w:eastAsia="Calibri" w:hAnsi="Calibri"/>
-                <w:sz w:val="22"/>
-                <w:szCs w:val="22"/>
-              </w:rPr>
-            </w:pPr>
-            <w:r>
-              <w:rPr>
-                <w:rFonts w:ascii="Calibri" w:cs="Calibri" w:eastAsia="Calibri" w:hAnsi="Calibri"/>
-                <w:sz w:val="22"/>
-                <w:szCs w:val="22"/>
-                <w:rtl w:val="0"/>
-              </w:rPr>
-              <w:t xml:space="preserve">Medium</w:t>
+              <w:t xml:space="preserve">JSON Export &amp; Correction Requests</w:t>
+            </w:r>
+          </w:p>
+        </w:tc>
+        <w:tc>
+          <w:tcPr/>
+          <w:p>
+            <w:pPr>
+              <w:spacing w:after="120" w:before="120" w:lineRule="auto"/>
+              <w:ind w:left="33" w:firstLine="0"/>
+              <w:rPr>
+                <w:rFonts w:ascii="Calibri" w:cs="Calibri" w:eastAsia="Calibri" w:hAnsi="Calibri"/>
+                <w:sz w:val="22"/>
+                <w:szCs w:val="22"/>
+              </w:rPr>
+            </w:pPr>
+            <w:r>
+              <w:rPr>
+                <w:rFonts w:ascii="Calibri" w:cs="Calibri" w:eastAsia="Calibri" w:hAnsi="Calibri"/>
+                <w:sz w:val="22"/>
+                <w:szCs w:val="22"/>
+                <w:rtl w:val="0"/>
+              </w:rPr>
+              <w:t xml:space="preserve">Simple</w:t>
             </w:r>
           </w:p>
         </w:tc>
@@ -4225,7 +4303,7 @@
                 <w:szCs w:val="22"/>
                 <w:rtl w:val="0"/>
               </w:rPr>
-              <w:t xml:space="preserve">Shared Platform Services Module</w:t>
+              <w:t xml:space="preserve">Data Import, Reporting and Shared Services Module</w:t>
             </w:r>
           </w:p>
         </w:tc>
@@ -4280,7 +4358,7 @@
                 <w:szCs w:val="22"/>
                 <w:rtl w:val="0"/>
               </w:rPr>
-              <w:t xml:space="preserve">14</w:t>
+              <w:t xml:space="preserve">19</w:t>
             </w:r>
           </w:p>
         </w:tc>
@@ -4334,7 +4412,7 @@
                 <w:szCs w:val="22"/>
                 <w:rtl w:val="0"/>
               </w:rPr>
-              <w:t xml:space="preserve">SSO Authentication &amp; Notifications</w:t>
+              <w:t xml:space="preserve">Indicator Data Import (Excel/CSV/Google Sheet)</w:t>
             </w:r>
           </w:p>
         </w:tc>
@@ -4435,7 +4513,7 @@
                 <w:szCs w:val="22"/>
                 <w:rtl w:val="0"/>
               </w:rPr>
-              <w:t xml:space="preserve">Bilingual UI (Vietnamese / English)</w:t>
+              <w:t xml:space="preserve">Case Reports &amp; Export</w:t>
             </w:r>
           </w:p>
         </w:tc>
@@ -4536,30 +4614,30 @@
                 <w:szCs w:val="22"/>
                 <w:rtl w:val="0"/>
               </w:rPr>
-              <w:t xml:space="preserve">Activity History &amp; Account Settings</w:t>
-            </w:r>
-          </w:p>
-        </w:tc>
-        <w:tc>
-          <w:tcPr/>
-          <w:p>
-            <w:pPr>
-              <w:spacing w:after="120" w:before="120" w:lineRule="auto"/>
-              <w:ind w:left="33" w:firstLine="0"/>
-              <w:rPr>
-                <w:rFonts w:ascii="Calibri" w:cs="Calibri" w:eastAsia="Calibri" w:hAnsi="Calibri"/>
-                <w:sz w:val="22"/>
-                <w:szCs w:val="22"/>
-              </w:rPr>
-            </w:pPr>
-            <w:r>
-              <w:rPr>
-                <w:rFonts w:ascii="Calibri" w:cs="Calibri" w:eastAsia="Calibri" w:hAnsi="Calibri"/>
-                <w:sz w:val="22"/>
-                <w:szCs w:val="22"/>
-                <w:rtl w:val="0"/>
-              </w:rPr>
-              <w:t xml:space="preserve">Simple</w:t>
+              <w:t xml:space="preserve">Sign-in, Email Notifications, Bilingual UI &amp; Settings</w:t>
+            </w:r>
+          </w:p>
+        </w:tc>
+        <w:tc>
+          <w:tcPr/>
+          <w:p>
+            <w:pPr>
+              <w:spacing w:after="120" w:before="120" w:lineRule="auto"/>
+              <w:ind w:left="33" w:firstLine="0"/>
+              <w:rPr>
+                <w:rFonts w:ascii="Calibri" w:cs="Calibri" w:eastAsia="Calibri" w:hAnsi="Calibri"/>
+                <w:sz w:val="22"/>
+                <w:szCs w:val="22"/>
+              </w:rPr>
+            </w:pPr>
+            <w:r>
+              <w:rPr>
+                <w:rFonts w:ascii="Calibri" w:cs="Calibri" w:eastAsia="Calibri" w:hAnsi="Calibri"/>
+                <w:sz w:val="22"/>
+                <w:szCs w:val="22"/>
+                <w:rtl w:val="0"/>
+              </w:rPr>
+              <w:t xml:space="preserve">Medium</w:t>
             </w:r>
           </w:p>
         </w:tc>
@@ -4583,7 +4661,7 @@
                 <w:szCs w:val="22"/>
                 <w:rtl w:val="0"/>
               </w:rPr>
-              <w:t xml:space="preserve">3</w:t>
+              <w:t xml:space="preserve">8</w:t>
             </w:r>
           </w:p>
         </w:tc>
@@ -4669,7 +4747,7 @@
                 <w:szCs w:val="22"/>
                 <w:rtl w:val="0"/>
               </w:rPr>
-              <w:t xml:space="preserve">144</w:t>
+              <w:t xml:space="preserve">134</w:t>
             </w:r>
           </w:p>
         </w:tc>
@@ -4735,7 +4813,7 @@
           <w:rFonts w:ascii="Calibri" w:cs="Calibri" w:eastAsia="Calibri" w:hAnsi="Calibri"/>
           <w:rtl w:val="0"/>
         </w:rPr>
-        <w:t xml:space="preserve">The objective of the AdviseCare project is to develop a web-based academic advising and student welfare management platform that treats the advising file as a consent-scoped, provenance-carrying, bitemporal evidential record rather than a profile page. The system enables academic advisors, welfare officers, and data protection stewards to manage student caseloads, welfare referrals, and audit-safe consent through a centralized web application, while giving students control over who may see which part of their record and why.</w:t>
+        <w:t xml:space="preserve">The objective of the AdviseCare project is to develop a web-based academic advising and student welfare management platform that matches each student's support request to a suitable advisor and tracks the case from request to closure. The system enables students to ask for academic or wellbeing support and choose which of their data to share, lets the Programme Head match cases to Academic Advisors (general or subject-specialised) or Wellbeing Advisors, and lets advisors and the Student Welfare Officer record notes, referrals and financial support, while every access to student data is decided by role, purpose and the student's consent.</w:t>
       </w:r>
     </w:p>
     <w:p>
@@ -4751,7 +4829,7 @@
           <w:rFonts w:ascii="Calibri" w:cs="Calibri" w:eastAsia="Calibri" w:hAnsi="Calibri"/>
           <w:rtl w:val="0"/>
         </w:rPr>
-        <w:t xml:space="preserve">The current project scope targets a single-faculty pilot deployment supported by a synthetic cohort of about five hundred students, while maintaining a modular architecture — consent and access control service, bitemporal advising ledger, indicator and provenance engine — capable of extending to additional faculties and live institutional data sources in future releases.</w:t>
+        <w:t xml:space="preserve">The current project scope focuses on the core of supporting students and advisors — account onboarding, support requests, manual case matching, case tracking, consent management and reporting — demonstrated on a synthetic cohort of students. The architecture keeps scheduled data ingestion, automated matching and in-app scheduling as later extensions rather than part of the current version.</w:t>
       </w:r>
     </w:p>
     <w:p>
@@ -5138,7 +5216,7 @@
                 <w:szCs w:val="22"/>
                 <w:rtl w:val="0"/>
               </w:rPr>
-              <w:t xml:space="preserve"> Review all requirements, bitemporal ERD, consent/access-control model and UI prototype before implementation</w:t>
+              <w:t xml:space="preserve">Review all requirements, ERD, consent/access-control model and UI prototype before implementation</w:t>
             </w:r>
           </w:p>
         </w:tc>
@@ -5283,7 +5361,7 @@
                 <w:szCs w:val="22"/>
                 <w:rtl w:val="0"/>
               </w:rPr>
-              <w:t xml:space="preserve">Backend services, policy decision point, indicator engine, utility classes </w:t>
+              <w:t xml:space="preserve">Backend services, access policy decision point, import validation, utility classes</w:t>
             </w:r>
           </w:p>
         </w:tc>
@@ -5428,7 +5506,7 @@
                 <w:szCs w:val="22"/>
                 <w:rtl w:val="0"/>
               </w:rPr>
-              <w:t xml:space="preserve">Frontend–Backend–Consent Service integration</w:t>
+              <w:t xml:space="preserve">Frontend–Backend–Google Sign-In–Email integration</w:t>
             </w:r>
           </w:p>
         </w:tc>
@@ -6072,7 +6150,7 @@
                 <w:szCs w:val="22"/>
                 <w:rtl w:val="0"/>
               </w:rPr>
-              <w:t xml:space="preserve">14</w:t>
+              <w:t xml:space="preserve">13</w:t>
             </w:r>
           </w:p>
         </w:tc>
@@ -6125,53 +6203,53 @@
                 <w:szCs w:val="22"/>
                 <w:rtl w:val="0"/>
               </w:rPr>
-              <w:t xml:space="preserve">System &amp; Data Model Design (Bitemporal Schema, ERD, API)</w:t>
-            </w:r>
-          </w:p>
-        </w:tc>
-        <w:tc>
-          <w:tcPr/>
-          <w:p>
-            <w:pPr>
-              <w:spacing w:after="120" w:before="120" w:lineRule="auto"/>
-              <w:ind w:left="33" w:firstLine="0"/>
-              <w:rPr>
-                <w:rFonts w:ascii="Calibri" w:cs="Calibri" w:eastAsia="Calibri" w:hAnsi="Calibri"/>
-                <w:sz w:val="22"/>
-                <w:szCs w:val="22"/>
-              </w:rPr>
-            </w:pPr>
-            <w:r>
-              <w:rPr>
-                <w:rFonts w:ascii="Calibri" w:cs="Calibri" w:eastAsia="Calibri" w:hAnsi="Calibri"/>
-                <w:sz w:val="22"/>
-                <w:szCs w:val="22"/>
-                <w:rtl w:val="0"/>
-              </w:rPr>
-              <w:t xml:space="preserve">18%</w:t>
-            </w:r>
-          </w:p>
-        </w:tc>
-        <w:tc>
-          <w:tcPr/>
-          <w:p>
-            <w:pPr>
-              <w:spacing w:after="120" w:before="120" w:lineRule="auto"/>
-              <w:ind w:left="33" w:firstLine="0"/>
-              <w:rPr>
-                <w:rFonts w:ascii="Calibri" w:cs="Calibri" w:eastAsia="Calibri" w:hAnsi="Calibri"/>
-                <w:sz w:val="22"/>
-                <w:szCs w:val="22"/>
-              </w:rPr>
-            </w:pPr>
-            <w:r>
-              <w:rPr>
-                <w:rFonts w:ascii="Calibri" w:cs="Calibri" w:eastAsia="Calibri" w:hAnsi="Calibri"/>
-                <w:sz w:val="22"/>
-                <w:szCs w:val="22"/>
-                <w:rtl w:val="0"/>
-              </w:rPr>
-              <w:t xml:space="preserve">26</w:t>
+              <w:t xml:space="preserve">System &amp; Data Model Design (ERD, Consent Model, API)</w:t>
+            </w:r>
+          </w:p>
+        </w:tc>
+        <w:tc>
+          <w:tcPr/>
+          <w:p>
+            <w:pPr>
+              <w:spacing w:after="120" w:before="120" w:lineRule="auto"/>
+              <w:ind w:left="33" w:firstLine="0"/>
+              <w:rPr>
+                <w:rFonts w:ascii="Calibri" w:cs="Calibri" w:eastAsia="Calibri" w:hAnsi="Calibri"/>
+                <w:sz w:val="22"/>
+                <w:szCs w:val="22"/>
+              </w:rPr>
+            </w:pPr>
+            <w:r>
+              <w:rPr>
+                <w:rFonts w:ascii="Calibri" w:cs="Calibri" w:eastAsia="Calibri" w:hAnsi="Calibri"/>
+                <w:sz w:val="22"/>
+                <w:szCs w:val="22"/>
+                <w:rtl w:val="0"/>
+              </w:rPr>
+              <w:t xml:space="preserve">16%</w:t>
+            </w:r>
+          </w:p>
+        </w:tc>
+        <w:tc>
+          <w:tcPr/>
+          <w:p>
+            <w:pPr>
+              <w:spacing w:after="120" w:before="120" w:lineRule="auto"/>
+              <w:ind w:left="33" w:firstLine="0"/>
+              <w:rPr>
+                <w:rFonts w:ascii="Calibri" w:cs="Calibri" w:eastAsia="Calibri" w:hAnsi="Calibri"/>
+                <w:sz w:val="22"/>
+                <w:szCs w:val="22"/>
+              </w:rPr>
+            </w:pPr>
+            <w:r>
+              <w:rPr>
+                <w:rFonts w:ascii="Calibri" w:cs="Calibri" w:eastAsia="Calibri" w:hAnsi="Calibri"/>
+                <w:sz w:val="22"/>
+                <w:szCs w:val="22"/>
+                <w:rtl w:val="0"/>
+              </w:rPr>
+              <w:t xml:space="preserve">21</w:t>
             </w:r>
           </w:p>
         </w:tc>
@@ -6270,7 +6348,7 @@
                 <w:szCs w:val="22"/>
                 <w:rtl w:val="0"/>
               </w:rPr>
-              <w:t xml:space="preserve">43</w:t>
+              <w:t xml:space="preserve">40</w:t>
             </w:r>
           </w:p>
         </w:tc>
@@ -6331,7 +6409,7 @@
                 <w:szCs w:val="22"/>
                 <w:rtl w:val="0"/>
               </w:rPr>
-              <w:t xml:space="preserve">Frontend Development (Advisor &amp; Student Portals)</w:t>
+              <w:t xml:space="preserve">Frontend Development (Student, Advisor &amp; Staff Portals)</w:t>
             </w:r>
           </w:p>
         </w:tc>
@@ -6358,7 +6436,7 @@
                 <w:szCs w:val="22"/>
                 <w:rtl w:val="0"/>
               </w:rPr>
-              <w:t xml:space="preserve">20%</w:t>
+              <w:t xml:space="preserve">22%</w:t>
             </w:r>
           </w:p>
         </w:tc>
@@ -6385,7 +6463,7 @@
                 <w:szCs w:val="22"/>
                 <w:rtl w:val="0"/>
               </w:rPr>
-              <w:t xml:space="preserve">29</w:t>
+              <w:t xml:space="preserve">30</w:t>
             </w:r>
           </w:p>
         </w:tc>
@@ -6446,7 +6524,7 @@
                 <w:szCs w:val="22"/>
                 <w:rtl w:val="0"/>
               </w:rPr>
-              <w:t xml:space="preserve">Testing &amp; Bug Fixing </w:t>
+              <w:t xml:space="preserve">Testing &amp; Bug Fixing</w:t>
             </w:r>
           </w:p>
         </w:tc>
@@ -6500,7 +6578,7 @@
                 <w:szCs w:val="22"/>
                 <w:rtl w:val="0"/>
               </w:rPr>
-              <w:t xml:space="preserve">17</w:t>
+              <w:t xml:space="preserve">16</w:t>
             </w:r>
           </w:p>
         </w:tc>
@@ -6561,7 +6639,7 @@
                 <w:szCs w:val="22"/>
                 <w:rtl w:val="0"/>
               </w:rPr>
-              <w:t xml:space="preserve">Documentation &amp; Project Management </w:t>
+              <w:t xml:space="preserve">Documentation &amp; Project Management</w:t>
             </w:r>
           </w:p>
         </w:tc>
@@ -6615,7 +6693,7 @@
                 <w:szCs w:val="22"/>
                 <w:rtl w:val="0"/>
               </w:rPr>
-              <w:t xml:space="preserve">15</w:t>
+              <w:t xml:space="preserve">14</w:t>
             </w:r>
           </w:p>
         </w:tc>
@@ -6887,7 +6965,7 @@
                 <w:szCs w:val="22"/>
                 <w:rtl w:val="0"/>
               </w:rPr>
-              <w:t xml:space="preserve">Bitemporal, append-only ledger design is unfamiliar to the team and has a steep learning curve, delaying WP3.</w:t>
+              <w:t xml:space="preserve">Scope keeps changing after reviewer and mentor feedback (actors, workflows, data model), causing rework.</w:t>
             </w:r>
           </w:p>
         </w:tc>
@@ -6933,30 +7011,30 @@
                 <w:szCs w:val="22"/>
                 <w:rtl w:val="0"/>
               </w:rPr>
-              <w:t xml:space="preserve">Medium</w:t>
-            </w:r>
-          </w:p>
-        </w:tc>
-        <w:tc>
-          <w:tcPr/>
-          <w:p>
-            <w:pPr>
-              <w:spacing w:after="120" w:before="120" w:lineRule="auto"/>
-              <w:ind w:left="33" w:firstLine="0"/>
-              <w:rPr>
-                <w:rFonts w:ascii="Calibri" w:cs="Calibri" w:eastAsia="Calibri" w:hAnsi="Calibri"/>
-                <w:sz w:val="22"/>
-                <w:szCs w:val="22"/>
-              </w:rPr>
-            </w:pPr>
-            <w:r>
-              <w:rPr>
-                <w:rFonts w:ascii="Calibri" w:cs="Calibri" w:eastAsia="Calibri" w:hAnsi="Calibri"/>
-                <w:sz w:val="22"/>
-                <w:szCs w:val="22"/>
-                <w:rtl w:val="0"/>
-              </w:rPr>
-              <w:t xml:space="preserve"> Prototype early, study the Snodgrass bitemporal model, timebox a design spike before full implementation.</w:t>
+              <w:t xml:space="preserve">High</w:t>
+            </w:r>
+          </w:p>
+        </w:tc>
+        <w:tc>
+          <w:tcPr/>
+          <w:p>
+            <w:pPr>
+              <w:spacing w:after="120" w:before="120" w:lineRule="auto"/>
+              <w:ind w:left="33" w:firstLine="0"/>
+              <w:rPr>
+                <w:rFonts w:ascii="Calibri" w:cs="Calibri" w:eastAsia="Calibri" w:hAnsi="Calibri"/>
+                <w:sz w:val="22"/>
+                <w:szCs w:val="22"/>
+              </w:rPr>
+            </w:pPr>
+            <w:r>
+              <w:rPr>
+                <w:rFonts w:ascii="Calibri" w:cs="Calibri" w:eastAsia="Calibri" w:hAnsi="Calibri"/>
+                <w:sz w:val="22"/>
+                <w:szCs w:val="22"/>
+                <w:rtl w:val="0"/>
+              </w:rPr>
+              <w:t xml:space="preserve">Freeze scope per milestone; keep the ERD, functional requirements and workflows as controlled documents; agree changes with the supervisor before adopting them.</w:t>
             </w:r>
           </w:p>
         </w:tc>
@@ -7010,7 +7088,7 @@
                 <w:szCs w:val="22"/>
                 <w:rtl w:val="0"/>
               </w:rPr>
-              <w:t xml:space="preserve">Per-attribute encryption and cryptographic erasure design (key management, AES-GCM) is complex to get right.</w:t>
+              <w:t xml:space="preserve">Per-attribute encryption and cryptographic erasure (envelope encryption, key handling) are complex to get right.</w:t>
             </w:r>
           </w:p>
         </w:tc>
@@ -7079,7 +7157,7 @@
                 <w:szCs w:val="22"/>
                 <w:rtl w:val="0"/>
               </w:rPr>
-              <w:t xml:space="preserve">Study key-store patterns early; run a dedicated security design review before implementation.</w:t>
+              <w:t xml:space="preserve">Use a simple envelope-encryption design (per-attribute keys wrapped by a master key in configuration); run a security design review before implementation.</w:t>
             </w:r>
           </w:p>
         </w:tc>
@@ -7133,7 +7211,30 @@
                 <w:szCs w:val="22"/>
                 <w:rtl w:val="0"/>
               </w:rPr>
-              <w:t xml:space="preserve">Faculty partnership needed for the blind-nomination validity study may not be secured.</w:t>
+              <w:t xml:space="preserve">The school provides no data source or API for FAP/FLM/LMS, so indicator data is limited to manual file imports.</w:t>
+            </w:r>
+          </w:p>
+        </w:tc>
+        <w:tc>
+          <w:tcPr/>
+          <w:p>
+            <w:pPr>
+              <w:spacing w:after="120" w:before="120" w:lineRule="auto"/>
+              <w:ind w:left="33" w:firstLine="0"/>
+              <w:rPr>
+                <w:rFonts w:ascii="Calibri" w:cs="Calibri" w:eastAsia="Calibri" w:hAnsi="Calibri"/>
+                <w:sz w:val="22"/>
+                <w:szCs w:val="22"/>
+              </w:rPr>
+            </w:pPr>
+            <w:r>
+              <w:rPr>
+                <w:rFonts w:ascii="Calibri" w:cs="Calibri" w:eastAsia="Calibri" w:hAnsi="Calibri"/>
+                <w:sz w:val="22"/>
+                <w:szCs w:val="22"/>
+                <w:rtl w:val="0"/>
+              </w:rPr>
+              <w:t xml:space="preserve">Medium</w:t>
             </w:r>
           </w:p>
         </w:tc>
@@ -7179,30 +7280,7 @@
                 <w:szCs w:val="22"/>
                 <w:rtl w:val="0"/>
               </w:rPr>
-              <w:t xml:space="preserve">High</w:t>
-            </w:r>
-          </w:p>
-        </w:tc>
-        <w:tc>
-          <w:tcPr/>
-          <w:p>
-            <w:pPr>
-              <w:spacing w:after="120" w:before="120" w:lineRule="auto"/>
-              <w:ind w:left="33" w:firstLine="0"/>
-              <w:rPr>
-                <w:rFonts w:ascii="Calibri" w:cs="Calibri" w:eastAsia="Calibri" w:hAnsi="Calibri"/>
-                <w:sz w:val="22"/>
-                <w:szCs w:val="22"/>
-              </w:rPr>
-            </w:pPr>
-            <w:r>
-              <w:rPr>
-                <w:rFonts w:ascii="Calibri" w:cs="Calibri" w:eastAsia="Calibri" w:hAnsi="Calibri"/>
-                <w:sz w:val="22"/>
-                <w:szCs w:val="22"/>
-                <w:rtl w:val="0"/>
-              </w:rPr>
-              <w:t xml:space="preserve">Secure a faculty partner within the first three weeks; fall back to advisor vignettes on the synthetic cohort if not secured.</w:t>
+              <w:t xml:space="preserve">Support Excel/CSV/Google Sheet imports with strict all-or-nothing validation; prepare synthetic datasets for every demo scenario.</w:t>
             </w:r>
           </w:p>
         </w:tc>
@@ -7256,7 +7334,7 @@
                 <w:szCs w:val="22"/>
                 <w:rtl w:val="0"/>
               </w:rPr>
-              <w:t xml:space="preserve">Team starts with mutable tables intending to add history later, so reconstruction and selective erasure never arrive.</w:t>
+              <w:t xml:space="preserve">History (point-in-time) data is accidentally updated, breaking the record of what an advisor saw on a given date.</w:t>
             </w:r>
           </w:p>
         </w:tc>
@@ -7325,7 +7403,7 @@
                 <w:szCs w:val="22"/>
                 <w:rtl w:val="0"/>
               </w:rPr>
-              <w:t xml:space="preserve">Commit to append-only storage, per-attribute keys, and access logging from WP2/WP3 kickoff; no mutable-table shortcut.</w:t>
+              <w:t xml:space="preserve">Expose create-read-delete only APIs for history tables; add a code-review checklist item and tests for point-in-time reconstruction.</w:t>
             </w:r>
           </w:p>
         </w:tc>
@@ -7379,7 +7457,7 @@
                 <w:szCs w:val="22"/>
                 <w:rtl w:val="0"/>
               </w:rPr>
-              <w:t xml:space="preserve">Purpose-based access control policy errors leak sensitive attributes across an unintended purpose.</w:t>
+              <w:t xml:space="preserve">Access policy errors leak sensitive attributes across an unintended purpose.</w:t>
             </w:r>
           </w:p>
         </w:tc>
@@ -7502,7 +7580,7 @@
                 <w:szCs w:val="22"/>
                 <w:rtl w:val="0"/>
               </w:rPr>
-              <w:t xml:space="preserve">Team members become unavailable due to academic workload.</w:t>
+              <w:t xml:space="preserve">Google sign-in setup or email delivery fails (OAuth configuration, linking emails landing in spam).</w:t>
             </w:r>
           </w:p>
         </w:tc>
@@ -7571,7 +7649,7 @@
                 <w:szCs w:val="22"/>
                 <w:rtl w:val="0"/>
               </w:rPr>
-              <w:t xml:space="preserve">Cross-train team members across work packages and maintain updated project documentation.</w:t>
+              <w:t xml:space="preserve">Set up Google OAuth and the email service early; test with real personal Gmail accounts; provide a resend option for linking emails.</w:t>
             </w:r>
           </w:p>
         </w:tc>
@@ -7625,7 +7703,7 @@
                 <w:szCs w:val="22"/>
                 <w:rtl w:val="0"/>
               </w:rPr>
-              <w:t xml:space="preserve">Database or consent-API redesign affects dependent modules (ledger, indicator engine, advisor workspace).</w:t>
+              <w:t xml:space="preserve">The limited number of advisors makes manual matching by the Programme Head a bottleneck.</w:t>
             </w:r>
           </w:p>
         </w:tc>
@@ -7671,30 +7749,30 @@
                 <w:szCs w:val="22"/>
                 <w:rtl w:val="0"/>
               </w:rPr>
-              <w:t xml:space="preserve">Low</w:t>
-            </w:r>
-          </w:p>
-        </w:tc>
-        <w:tc>
-          <w:tcPr/>
-          <w:p>
-            <w:pPr>
-              <w:spacing w:after="120" w:before="120" w:lineRule="auto"/>
-              <w:ind w:left="33" w:firstLine="0"/>
-              <w:rPr>
-                <w:rFonts w:ascii="Calibri" w:cs="Calibri" w:eastAsia="Calibri" w:hAnsi="Calibri"/>
-                <w:sz w:val="22"/>
-                <w:szCs w:val="22"/>
-              </w:rPr>
-            </w:pPr>
-            <w:r>
-              <w:rPr>
-                <w:rFonts w:ascii="Calibri" w:cs="Calibri" w:eastAsia="Calibri" w:hAnsi="Calibri"/>
-                <w:sz w:val="22"/>
-                <w:szCs w:val="22"/>
-                <w:rtl w:val="0"/>
-              </w:rPr>
-              <w:t xml:space="preserve">Finalize the bitemporal schema and consent API contracts before implementation; manage changes via version control.</w:t>
+              <w:t xml:space="preserve">Medium</w:t>
+            </w:r>
+          </w:p>
+        </w:tc>
+        <w:tc>
+          <w:tcPr/>
+          <w:p>
+            <w:pPr>
+              <w:spacing w:after="120" w:before="120" w:lineRule="auto"/>
+              <w:ind w:left="33" w:firstLine="0"/>
+              <w:rPr>
+                <w:rFonts w:ascii="Calibri" w:cs="Calibri" w:eastAsia="Calibri" w:hAnsi="Calibri"/>
+                <w:sz w:val="22"/>
+                <w:szCs w:val="22"/>
+              </w:rPr>
+            </w:pPr>
+            <w:r>
+              <w:rPr>
+                <w:rFonts w:ascii="Calibri" w:cs="Calibri" w:eastAsia="Calibri" w:hAnsi="Calibri"/>
+                <w:sz w:val="22"/>
+                <w:szCs w:val="22"/>
+                <w:rtl w:val="0"/>
+              </w:rPr>
+              <w:t xml:space="preserve">Show advisor workload and specialisation on the matching screen; keep the design ready for automated matching later.</w:t>
             </w:r>
           </w:p>
         </w:tc>
@@ -7748,7 +7826,7 @@
                 <w:szCs w:val="22"/>
                 <w:rtl w:val="0"/>
               </w:rPr>
-              <w:t xml:space="preserve">Synthetic dataset does not cover enough demo scenarios (consent withdrawal, retroactive correction, missing data).</w:t>
+              <w:t xml:space="preserve">Team members become unavailable due to academic workload.</w:t>
             </w:r>
           </w:p>
         </w:tc>
@@ -7794,30 +7872,30 @@
                 <w:szCs w:val="22"/>
                 <w:rtl w:val="0"/>
               </w:rPr>
-              <w:t xml:space="preserve">Low</w:t>
-            </w:r>
-          </w:p>
-        </w:tc>
-        <w:tc>
-          <w:tcPr/>
-          <w:p>
-            <w:pPr>
-              <w:spacing w:after="120" w:before="120" w:lineRule="auto"/>
-              <w:ind w:left="33" w:firstLine="0"/>
-              <w:rPr>
-                <w:rFonts w:ascii="Calibri" w:cs="Calibri" w:eastAsia="Calibri" w:hAnsi="Calibri"/>
-                <w:sz w:val="22"/>
-                <w:szCs w:val="22"/>
-              </w:rPr>
-            </w:pPr>
-            <w:r>
-              <w:rPr>
-                <w:rFonts w:ascii="Calibri" w:cs="Calibri" w:eastAsia="Calibri" w:hAnsi="Calibri"/>
-                <w:sz w:val="22"/>
-                <w:szCs w:val="22"/>
-                <w:rtl w:val="0"/>
-              </w:rPr>
-              <w:t xml:space="preserve">Design dataset scenarios up front per the proposal; validate against the provenance, consent-withdrawal and reconstruction demo scripts.</w:t>
+              <w:t xml:space="preserve">Medium</w:t>
+            </w:r>
+          </w:p>
+        </w:tc>
+        <w:tc>
+          <w:tcPr/>
+          <w:p>
+            <w:pPr>
+              <w:spacing w:after="120" w:before="120" w:lineRule="auto"/>
+              <w:ind w:left="33" w:firstLine="0"/>
+              <w:rPr>
+                <w:rFonts w:ascii="Calibri" w:cs="Calibri" w:eastAsia="Calibri" w:hAnsi="Calibri"/>
+                <w:sz w:val="22"/>
+                <w:szCs w:val="22"/>
+              </w:rPr>
+            </w:pPr>
+            <w:r>
+              <w:rPr>
+                <w:rFonts w:ascii="Calibri" w:cs="Calibri" w:eastAsia="Calibri" w:hAnsi="Calibri"/>
+                <w:sz w:val="22"/>
+                <w:szCs w:val="22"/>
+                <w:rtl w:val="0"/>
+              </w:rPr>
+              <w:t xml:space="preserve">Cross-train team members across work packages and maintain updated project documentation.</w:t>
             </w:r>
           </w:p>
         </w:tc>
@@ -7871,7 +7949,7 @@
                 <w:szCs w:val="22"/>
                 <w:rtl w:val="0"/>
               </w:rPr>
-              <w:t xml:space="preserve">Third-party service outages (GitHub, hosting, PostgreSQL).</w:t>
+              <w:t xml:space="preserve">Third-party service outages (GitHub, Render/MonsterASP hosting, Microsoft SQL Server, email service).</w:t>
             </w:r>
           </w:p>
         </w:tc>
@@ -7985,7 +8063,7 @@
           <w:rFonts w:ascii="Calibri" w:cs="Calibri" w:eastAsia="Calibri" w:hAnsi="Calibri"/>
           <w:rtl w:val="0"/>
         </w:rPr>
-        <w:t xml:space="preserve">The project adopts an Agile Scrum development methodology to support iterative implementation, continuous stakeholder feedback, and incremental delivery of software modules. Since the platform combines a consent and access control service, a bitemporal advising ledger, and advisor/student-facing web applications, Agile allows each work package to evolve independently while remaining synchronized through well-defined API contracts.</w:t>
+        <w:t xml:space="preserve">The project adopts an Agile Scrum development methodology to support iterative implementation, continuous stakeholder feedback, and incremental delivery of software modules. Since the platform combines student support requests, manual case matching, case tracking and a consent and access control layer across student, advisor, welfare and administration portals, Agile allows each work package to evolve independently while remaining synchronized through well-defined API contracts.</w:t>
       </w:r>
     </w:p>
     <w:p>
@@ -8001,7 +8079,7 @@
           <w:rFonts w:ascii="Calibri" w:cs="Calibri" w:eastAsia="Calibri" w:hAnsi="Calibri"/>
           <w:rtl w:val="0"/>
         </w:rPr>
-        <w:t xml:space="preserve">Development is organized into two-week sprints. Each sprint begins with Sprint Planning, followed by implementation, daily progress tracking, code reviews, testing, and Sprint Review. Features are prioritized according to business value and technical dependency. High-risk modules such as the consent and access control service, the bitemporal advising ledger, and cryptographic erasure are developed incrementally with frequent integration testing to reduce technical risk, in line with the note that these models cannot be retrofitted later.</w:t>
+        <w:t xml:space="preserve">Development is organized into two-week sprints. Each sprint begins with Sprint Planning, followed by implementation, daily progress tracking, code reviews, testing, and Sprint Review. Features are prioritized according to business value and technical dependency. High-risk parts such as the consent and access control layer, cryptographic erasure and the history data behind point-in-time views are developed early and incrementally with frequent integration testing, since they are hard to add later.</w:t>
       </w:r>
     </w:p>
     <w:p>
@@ -8071,12 +8149,12 @@
           <wp:inline distB="114300" distT="114300" distL="114300" distR="114300">
             <wp:extent cx="5731200" cy="1689100"/>
             <wp:effectExtent b="0" l="0" r="0" t="0"/>
-            <wp:docPr id="1" name="image2.png"/>
+            <wp:docPr id="1" name="image1.png"/>
             <a:graphic>
               <a:graphicData uri="http://schemas.openxmlformats.org/drawingml/2006/picture">
                 <pic:pic>
                   <pic:nvPicPr>
-                    <pic:cNvPr id="0" name="image2.png"/>
+                    <pic:cNvPr id="0" name="image1.png"/>
                     <pic:cNvPicPr preferRelativeResize="0"/>
                   </pic:nvPicPr>
                   <pic:blipFill>
@@ -8416,7 +8494,7 @@
           <w:rFonts w:ascii="Calibri" w:cs="Calibri" w:eastAsia="Calibri" w:hAnsi="Calibri"/>
           <w:rtl w:val="0"/>
         </w:rPr>
-        <w:t xml:space="preserve">Ensure consistency between backend APIs and the consent/access-control service.</w:t>
+        <w:t xml:space="preserve">Ensure consistency between backend APIs and the consent/access-control rules.</w:t>
       </w:r>
     </w:p>
     <w:p>
@@ -8479,7 +8557,7 @@
           <w:rFonts w:ascii="Calibri" w:cs="Calibri" w:eastAsia="Calibri" w:hAnsi="Calibri"/>
           <w:rtl w:val="0"/>
         </w:rPr>
-        <w:t xml:space="preserve">Test authentication, consent policy evaluation, and bitemporal query logic.</w:t>
+        <w:t xml:space="preserve">Test authentication, consent policy evaluation, and point-in-time query logic.</w:t>
       </w:r>
     </w:p>
     <w:p>
@@ -8499,7 +8577,7 @@
           <w:rFonts w:ascii="Calibri" w:cs="Calibri" w:eastAsia="Calibri" w:hAnsi="Calibri"/>
           <w:rtl w:val="0"/>
         </w:rPr>
-        <w:t xml:space="preserve">Verify indicator and provenance calculations independently.</w:t>
+        <w:t xml:space="preserve">Verify import validation and case matching rules independently.</w:t>
       </w:r>
     </w:p>
     <w:p>
@@ -8577,7 +8655,7 @@
           <w:rFonts w:ascii="Calibri" w:cs="Calibri" w:eastAsia="Calibri" w:hAnsi="Calibri"/>
           <w:rtl w:val="0"/>
         </w:rPr>
-        <w:t xml:space="preserve">Backend ↔ PostgreSQL</w:t>
+        <w:t xml:space="preserve">Backend ↔ Microsoft SQL Server</w:t>
       </w:r>
     </w:p>
     <w:p>
@@ -8597,7 +8675,7 @@
           <w:rFonts w:ascii="Calibri" w:cs="Calibri" w:eastAsia="Calibri" w:hAnsi="Calibri"/>
           <w:rtl w:val="0"/>
         </w:rPr>
-        <w:t xml:space="preserve">Backend ↔ Consent &amp; Access Control Service</w:t>
+        <w:t xml:space="preserve">Backend ↔ Google Sign-In &amp; Email Service</w:t>
       </w:r>
     </w:p>
     <w:p>
@@ -8675,7 +8753,7 @@
           <w:rFonts w:ascii="Calibri" w:cs="Calibri" w:eastAsia="Calibri" w:hAnsi="Calibri"/>
           <w:rtl w:val="0"/>
         </w:rPr>
-        <w:t xml:space="preserve">Advisor opens caseload and views a student profile with provenance</w:t>
+        <w:t xml:space="preserve">Admin bulk-imports accounts and students link their personal Google accounts</w:t>
       </w:r>
     </w:p>
     <w:p>
@@ -8695,7 +8773,7 @@
           <w:rFonts w:ascii="Calibri" w:cs="Calibri" w:eastAsia="Calibri" w:hAnsi="Calibri"/>
           <w:rtl w:val="0"/>
         </w:rPr>
-        <w:t xml:space="preserve">Student grants and withdraws consent for a purpose</w:t>
+        <w:t xml:space="preserve">Student submits a support request and shares chosen data attributes</w:t>
       </w:r>
     </w:p>
     <w:p>
@@ -8715,7 +8793,7 @@
           <w:rFonts w:ascii="Calibri" w:cs="Calibri" w:eastAsia="Calibri" w:hAnsi="Calibri"/>
           <w:rtl w:val="0"/>
         </w:rPr>
-        <w:t xml:space="preserve">System reconstructs a past advising decision (point-in-time query)</w:t>
+        <w:t xml:space="preserve">Programme head matches the case and the student receives the advisor's contact information</w:t>
       </w:r>
     </w:p>
     <w:p>
@@ -8735,7 +8813,7 @@
           <w:rFonts w:ascii="Calibri" w:cs="Calibri" w:eastAsia="Calibri" w:hAnsi="Calibri"/>
           <w:rtl w:val="0"/>
         </w:rPr>
-        <w:t xml:space="preserve">Advisor records a note and advances a case through the workflow</w:t>
+        <w:t xml:space="preserve">Advisor records notes, advances the case and refers money matters to the welfare officer</w:t>
       </w:r>
     </w:p>
     <w:p>
@@ -8755,7 +8833,7 @@
           <w:rFonts w:ascii="Calibri" w:cs="Calibri" w:eastAsia="Calibri" w:hAnsi="Calibri"/>
           <w:rtl w:val="0"/>
         </w:rPr>
-        <w:t xml:space="preserve">Welfare officer receives and triages a referral</w:t>
+        <w:t xml:space="preserve">Student withdraws consent and the steward executes erasure</w:t>
       </w:r>
     </w:p>
     <w:p>
@@ -8775,7 +8853,7 @@
           <w:rFonts w:ascii="Calibri" w:cs="Calibri" w:eastAsia="Calibri" w:hAnsi="Calibri"/>
           <w:rtl w:val="0"/>
         </w:rPr>
-        <w:t xml:space="preserve">Programme head views an anonymised cohort report</w:t>
+        <w:t xml:space="preserve">Programme head exports a case report for a time range</w:t>
       </w:r>
     </w:p>
     <w:p>
@@ -9027,7 +9105,21 @@
                 <w:highlight w:val="white"/>
                 <w:rtl w:val="0"/>
               </w:rPr>
-              <w:t xml:space="preserve">Bitemporal Data Modelling &amp; PostgreSQL</w:t>
+              <w:t xml:space="preserve">History / Point-in-Time Data Modelling &amp; Microsoft SQL Server</w:t>
+            </w:r>
+            <w:r>
+              <w:rPr>
+                <w:rFonts w:ascii="Calibri" w:cs="Calibri" w:eastAsia="Calibri" w:hAnsi="Calibri"/>
+                <w:sz w:val="22"/>
+                <w:szCs w:val="22"/>
+                <w:rtl w:val="0"/>
+              </w:rPr>
+              <w:t xml:space="preserve"/>
+            </w:r>
+            <w:r>
+              <w:rPr>
+                <w:rtl w:val="0"/>
+              </w:rPr>
             </w:r>
           </w:p>
         </w:tc>
@@ -9130,7 +9222,7 @@
                 <w:highlight w:val="white"/>
                 <w:rtl w:val="0"/>
               </w:rPr>
-              <w:t xml:space="preserve">Purpose-Based Access Control &amp; Cryptographic Erasure (AES-GCM, Key Management)</w:t>
+              <w:t xml:space="preserve">Purpose-Based Access Control &amp; Cryptographic Erasure (AES-GCM, Envelope Encryption)</w:t>
             </w:r>
           </w:p>
         </w:tc>
@@ -9233,7 +9325,7 @@
                 <w:highlight w:val="white"/>
                 <w:rtl w:val="0"/>
               </w:rPr>
-              <w:t xml:space="preserve">ASP.NET Core Security (OAuth2/OIDC, JWT)</w:t>
+              <w:t xml:space="preserve">ASP.NET Core Security (Google OAuth2/OIDC, JWT)</w:t>
             </w:r>
           </w:p>
         </w:tc>
@@ -9906,7 +9998,7 @@
                 <w:highlight w:val="white"/>
                 <w:rtl w:val="0"/>
               </w:rPr>
-              <w:t xml:space="preserve">System architecture, bitemporal ERD, consent/access-control design, API design and UI prototype. </w:t>
+              <w:t xml:space="preserve">System architecture, ERD, consent/access-control design, API design and UI prototype.</w:t>
             </w:r>
           </w:p>
         </w:tc>
@@ -10009,7 +10101,7 @@
                 <w:highlight w:val="white"/>
                 <w:rtl w:val="0"/>
               </w:rPr>
-              <w:t xml:space="preserve">Consent registry, purpose-based access control policy engine, and initial backend infrastructure completed. </w:t>
+              <w:t xml:space="preserve">Account onboarding (bulk import, Google linking), master data, consent registry and access policy engine completed.</w:t>
             </w:r>
           </w:p>
         </w:tc>
@@ -10112,7 +10204,7 @@
                 <w:highlight w:val="white"/>
                 <w:rtl w:val="0"/>
               </w:rPr>
-              <w:t xml:space="preserve">Bitemporal advising ledger, case workflow, and advisor caseload workspace completed. </w:t>
+              <w:t xml:space="preserve">Support requests, manual case matching, advisor workspace and case workflow completed.</w:t>
             </w:r>
           </w:p>
         </w:tc>
@@ -10215,7 +10307,7 @@
                 <w:highlight w:val="white"/>
                 <w:rtl w:val="0"/>
               </w:rPr>
-              <w:t xml:space="preserve">Welfare referral module, student self-service portal, indicator engine and complete feature integration. </w:t>
+              <w:t xml:space="preserve">Welfare support, student self-service, indicator import, reporting and complete feature integration.</w:t>
             </w:r>
           </w:p>
         </w:tc>
@@ -10524,7 +10616,7 @@
                 <w:highlight w:val="white"/>
                 <w:rtl w:val="0"/>
               </w:rPr>
-              <w:t xml:space="preserve">Fully integrated consent-scoped advising platform ready for pilot deployment. </w:t>
+              <w:t xml:space="preserve">Fully integrated student support matching and tracking platform ready for pilot deployment.</w:t>
             </w:r>
           </w:p>
         </w:tc>
@@ -11226,7 +11318,7 @@
                 <w:szCs w:val="22"/>
                 <w:rtl w:val="0"/>
               </w:rPr>
-              <w:t xml:space="preserve">Bitemporal Schema, ERD &amp; Database Design</w:t>
+              <w:t xml:space="preserve">ERD &amp; Database Design</w:t>
             </w:r>
           </w:p>
         </w:tc>
@@ -13347,7 +13439,7 @@
           <w:rFonts w:ascii="Calibri" w:cs="Calibri" w:eastAsia="Calibri" w:hAnsi="Calibri"/>
           <w:rtl w:val="0"/>
         </w:rPr>
-        <w:t xml:space="preserve">Major project artifacts — including the bitemporal ERD, consent and access-control policy model, API specifications, and UI designs — are treated as controlled documents. Any modification requires agreement among team members to prevent inconsistencies between analysis, design, and implementation.</w:t>
+        <w:t xml:space="preserve">Major project artifacts — including the ERD, consent and access-control policy model, API specifications, and UI designs — are treated as controlled documents. Any modification requires agreement among team members to prevent inconsistencies between analysis, design, and implementation.</w:t>
       </w:r>
       <w:r>
         <w:rPr>
@@ -13765,7 +13857,7 @@
                 <w:szCs w:val="22"/>
                 <w:rtl w:val="0"/>
               </w:rPr>
-              <w:t xml:space="preserve">OIDC/OAuth2 + JWT, custom RBAC/PBAC policy engine, AES-256-GCM encryption, application-level key management </w:t>
+              <w:t xml:space="preserve">Google Sign-In (OAuth2/OIDC) + JWT, role/purpose-based access policy engine, AES-256-GCM envelope encryption</w:t>
             </w:r>
           </w:p>
         </w:tc>
@@ -13875,7 +13967,7 @@
                 <w:szCs w:val="22"/>
                 <w:rtl w:val="0"/>
               </w:rPr>
-              <w:t xml:space="preserve">ASP.NET Core Web API, Entity Framework Core </w:t>
+              <w:t xml:space="preserve">ASP.NET Core Web API</w:t>
             </w:r>
           </w:p>
         </w:tc>
@@ -13930,7 +14022,7 @@
                 <w:szCs w:val="22"/>
                 <w:rtl w:val="0"/>
               </w:rPr>
-              <w:t xml:space="preserve">PostgreSQL (bitemporal schema, append-only audit tables) </w:t>
+              <w:t xml:space="preserve">Microsoft SQL Server</w:t>
             </w:r>
           </w:p>
         </w:tc>
@@ -14259,7 +14351,7 @@
                 <w:szCs w:val="22"/>
                 <w:rtl w:val="0"/>
               </w:rPr>
-              <w:t xml:space="preserve">Docker, Docker Compose, cloud container hosting, PostgreSQL Server </w:t>
+              <w:t xml:space="preserve">Cloud container hosting (Render, MonsterASP)</w:t>
             </w:r>
           </w:p>
         </w:tc>
@@ -14314,7 +14406,7 @@
                 <w:szCs w:val="22"/>
                 <w:rtl w:val="0"/>
               </w:rPr>
-              <w:t xml:space="preserve">GitHub Projects, Trello </w:t>
+              <w:t xml:space="preserve">GitHub Projects</w:t>
             </w:r>
           </w:p>
         </w:tc>

</xml_diff>